<commit_message>
feat: complete resumable run experience
</commit_message>
<xml_diff>
--- a/output/ui/Worlds_UI_and_Brand_Direction.docx
+++ b/output/ui/Worlds_UI_and_Brand_Direction.docx
@@ -14273,7 +14273,7 @@
           <w:color w:val="0B0C0E"/>
           <w:sz w:val="21"/>
         </w:rPr>
-        <w:t>Pause, volume and captions remain available. Skip-forward is not a primary control because story timing and movement are connected. If a runner misses a line, offer a single 'Repeat last line' action and preserve state.</w:t>
+        <w:t>Pause, volume and captions remain available. Pausing opens a protected sheet with Resume run as the primary action and End run &amp; view summary as a clear secondary action. The system back control opens this sheet rather than abandoning the session. Skip-forward is not a primary control because story timing and movement are connected. If a runner misses a line, offer a single 'Repeat last line' action and preserve state.</w:t>
       </w:r>
     </w:p>
     <w:p>
@@ -15047,6 +15047,624 @@
           <w:color w:val="FF4F2E"/>
           <w:sz w:val="17"/>
         </w:rPr>
+        <w:t>16A / EARLY-RUN SUMMARY</w:t>
+      </w:r>
+    </w:p>
+    <w:p>
+      <w:pPr>
+        <w:keepNext/>
+        <w:keepLines/>
+        <w:spacing w:before="0" w:after="180" w:line="240" w:lineRule="auto"/>
+        <w:jc w:val="left"/>
+      </w:pPr>
+      <w:r>
+        <w:rPr>
+          <w:rFonts w:ascii="Arial" w:hAnsi="Arial"/>
+          <w:b/>
+          <w:i w:val="0"/>
+          <w:caps w:val="0"/>
+          <w:color w:val="0B0C0E"/>
+          <w:sz w:val="46"/>
+        </w:rPr>
+        <w:t>Close the workout. Keep the story.</w:t>
+      </w:r>
+    </w:p>
+    <w:p>
+      <w:pPr>
+        <w:keepLines w:val="0"/>
+        <w:spacing w:before="0" w:after="300" w:line="300" w:lineRule="auto"/>
+        <w:jc w:val="left"/>
+      </w:pPr>
+      <w:r>
+        <w:rPr>
+          <w:rFonts w:ascii="Arial" w:hAnsi="Arial"/>
+          <w:b w:val="0"/>
+          <w:i w:val="0"/>
+          <w:caps w:val="0"/>
+          <w:color w:val="686A70"/>
+          <w:sz w:val="23"/>
+        </w:rPr>
+        <w:t>Ending a physical run before a story beat is complete opens a functional summary, distinct from the completed-story recap. It may lead with distance, duration and average pace because the runner is closing a workout, but it must immediately confirm the saved story checkpoint and the next authored objective.</w:t>
+      </w:r>
+    </w:p>
+    <w:p>
+      <w:pPr>
+        <w:spacing w:before="0" w:after="360"/>
+        <w:pBdr>
+          <w:bottom w:val="single" w:sz="16" w:space="1" w:color="FF4F2E"/>
+        </w:pBdr>
+      </w:pPr>
+    </w:p>
+    <w:p>
+      <w:pPr>
+        <w:keepNext/>
+        <w:keepLines/>
+        <w:spacing w:before="260" w:after="120" w:line="252" w:lineRule="auto"/>
+        <w:jc w:val="left"/>
+      </w:pPr>
+      <w:r>
+        <w:rPr>
+          <w:rFonts w:ascii="Arial" w:hAnsi="Arial"/>
+          <w:b/>
+          <w:i w:val="0"/>
+          <w:caps w:val="0"/>
+          <w:color w:val="0B0C0E"/>
+          <w:sz w:val="30"/>
+        </w:rPr>
+        <w:t>Summary order</w:t>
+      </w:r>
+    </w:p>
+    <w:p>
+      <w:pPr>
+        <w:spacing w:after="100" w:line="276" w:lineRule="auto"/>
+        <w:numPr>
+          <w:ilvl w:val="0"/>
+          <w:numId w:val="14"/>
+        </w:numPr>
+      </w:pPr>
+      <w:r>
+        <w:rPr>
+          <w:rFonts w:ascii="Arial" w:hAnsi="Arial"/>
+          <w:b w:val="0"/>
+          <w:i w:val="0"/>
+          <w:caps w:val="0"/>
+          <w:color w:val="0B0C0E"/>
+          <w:sz w:val="20"/>
+        </w:rPr>
+        <w:t>Run facts - Distance is dominant; duration and average pace are secondary. No calories, badges or score.</w:t>
+      </w:r>
+    </w:p>
+    <w:p>
+      <w:pPr>
+        <w:spacing w:after="100" w:line="276" w:lineRule="auto"/>
+        <w:numPr>
+          <w:ilvl w:val="0"/>
+          <w:numId w:val="14"/>
+        </w:numPr>
+      </w:pPr>
+      <w:r>
+        <w:rPr>
+          <w:rFonts w:ascii="Arial" w:hAnsi="Arial"/>
+          <w:b w:val="0"/>
+          <w:i w:val="0"/>
+          <w:caps w:val="0"/>
+          <w:color w:val="0B0C0E"/>
+          <w:sz w:val="20"/>
+        </w:rPr>
+        <w:t>Story state - Show a named checkpoint plus segmented moments reached; use a count, not a percentage or completion grade.</w:t>
+      </w:r>
+    </w:p>
+    <w:p>
+      <w:pPr>
+        <w:spacing w:after="100" w:line="276" w:lineRule="auto"/>
+        <w:numPr>
+          <w:ilvl w:val="0"/>
+          <w:numId w:val="14"/>
+        </w:numPr>
+      </w:pPr>
+      <w:r>
+        <w:rPr>
+          <w:rFonts w:ascii="Arial" w:hAnsi="Arial"/>
+          <w:b w:val="0"/>
+          <w:i w:val="0"/>
+          <w:caps w:val="0"/>
+          <w:color w:val="0B0C0E"/>
+          <w:sz w:val="20"/>
+        </w:rPr>
+        <w:t>Continuation - Resume story returns to run planning and promises continuation from the saved checkpoint.</w:t>
+      </w:r>
+    </w:p>
+    <w:p>
+      <w:pPr>
+        <w:keepNext/>
+        <w:keepLines/>
+        <w:spacing w:before="260" w:after="120" w:line="252" w:lineRule="auto"/>
+        <w:jc w:val="left"/>
+      </w:pPr>
+      <w:r>
+        <w:rPr>
+          <w:rFonts w:ascii="Arial" w:hAnsi="Arial"/>
+          <w:b/>
+          <w:i w:val="0"/>
+          <w:caps w:val="0"/>
+          <w:color w:val="0B0C0E"/>
+          <w:sz w:val="30"/>
+        </w:rPr>
+        <w:t>State handoff</w:t>
+      </w:r>
+    </w:p>
+    <w:tbl>
+      <w:tblPr>
+        <w:tblW w:type="dxa" w:w="10296"/>
+        <w:jc w:val="left"/>
+        <w:tblLayout w:type="fixed"/>
+        <w:tblLook w:firstColumn="1" w:firstRow="1" w:lastColumn="0" w:lastRow="0" w:noHBand="0" w:noVBand="1" w:val="04A0"/>
+        <w:tblInd w:w="0" w:type="dxa"/>
+      </w:tblPr>
+      <w:tblGrid>
+        <w:gridCol w:w="1944"/>
+        <w:gridCol w:w="8352"/>
+      </w:tblGrid>
+      <w:tr>
+        <w:trPr>
+          <w:tblHeader w:val="true"/>
+        </w:trPr>
+        <w:tc>
+          <w:tcPr>
+            <w:tcW w:type="dxa" w:w="1944"/>
+            <w:shd w:fill="0B0C0E"/>
+            <w:tcMar>
+              <w:top w:w="120" w:type="dxa"/>
+              <w:start w:w="140" w:type="dxa"/>
+              <w:bottom w:w="120" w:type="dxa"/>
+              <w:end w:w="140" w:type="dxa"/>
+            </w:tcMar>
+            <w:vAlign w:val="center"/>
+            <w:tcBorders>
+              <w:top w:val="single" w:sz="5" w:color="D8D6D0"/>
+              <w:start w:val="single" w:sz="5" w:color="D8D6D0"/>
+              <w:bottom w:val="single" w:sz="5" w:color="D8D6D0"/>
+              <w:end w:val="single" w:sz="5" w:color="D8D6D0"/>
+            </w:tcBorders>
+          </w:tcPr>
+          <w:p>
+            <w:pPr>
+              <w:spacing w:after="0"/>
+            </w:pPr>
+            <w:r>
+              <w:rPr>
+                <w:rFonts w:ascii="Arial" w:hAnsi="Arial"/>
+                <w:b/>
+                <w:i w:val="0"/>
+                <w:caps w:val="0"/>
+                <w:color w:val="FFFFFF"/>
+                <w:sz w:val="15"/>
+              </w:rPr>
+              <w:t>MOMENT</w:t>
+            </w:r>
+          </w:p>
+        </w:tc>
+        <w:tc>
+          <w:tcPr>
+            <w:tcW w:type="dxa" w:w="8352"/>
+            <w:shd w:fill="0B0C0E"/>
+            <w:tcMar>
+              <w:top w:w="120" w:type="dxa"/>
+              <w:start w:w="140" w:type="dxa"/>
+              <w:bottom w:w="120" w:type="dxa"/>
+              <w:end w:w="140" w:type="dxa"/>
+            </w:tcMar>
+            <w:vAlign w:val="center"/>
+            <w:tcBorders>
+              <w:top w:val="single" w:sz="5" w:color="D8D6D0"/>
+              <w:start w:val="single" w:sz="5" w:color="D8D6D0"/>
+              <w:bottom w:val="single" w:sz="5" w:color="D8D6D0"/>
+              <w:end w:val="single" w:sz="5" w:color="D8D6D0"/>
+            </w:tcBorders>
+          </w:tcPr>
+          <w:p>
+            <w:pPr>
+              <w:spacing w:after="0"/>
+            </w:pPr>
+            <w:r>
+              <w:rPr>
+                <w:rFonts w:ascii="Arial" w:hAnsi="Arial"/>
+                <w:b/>
+                <w:i w:val="0"/>
+                <w:caps w:val="0"/>
+                <w:color w:val="FFFFFF"/>
+                <w:sz w:val="15"/>
+              </w:rPr>
+              <w:t>REQUIRED BEHAVIOR</w:t>
+            </w:r>
+          </w:p>
+        </w:tc>
+      </w:tr>
+      <w:tr>
+        <w:tc>
+          <w:tcPr>
+            <w:tcW w:type="dxa" w:w="1944"/>
+            <w:shd w:fill="FFFFFF"/>
+            <w:tcMar>
+              <w:top w:w="125" w:type="dxa"/>
+              <w:start w:w="140" w:type="dxa"/>
+              <w:bottom w:w="125" w:type="dxa"/>
+              <w:end w:w="140" w:type="dxa"/>
+            </w:tcMar>
+            <w:vAlign w:val="center"/>
+            <w:tcBorders>
+              <w:top w:val="single" w:sz="5" w:color="D8D6D0"/>
+              <w:start w:val="single" w:sz="5" w:color="D8D6D0"/>
+              <w:bottom w:val="single" w:sz="5" w:color="D8D6D0"/>
+              <w:end w:val="single" w:sz="5" w:color="D8D6D0"/>
+            </w:tcBorders>
+          </w:tcPr>
+          <w:p>
+            <w:pPr>
+              <w:spacing w:after="0" w:line="269" w:lineRule="auto"/>
+            </w:pPr>
+            <w:r>
+              <w:rPr>
+                <w:rFonts w:ascii="Arial" w:hAnsi="Arial"/>
+                <w:b/>
+                <w:i w:val="0"/>
+                <w:caps w:val="0"/>
+                <w:color w:val="0B0C0E"/>
+                <w:sz w:val="17"/>
+              </w:rPr>
+              <w:t>Pause</w:t>
+            </w:r>
+          </w:p>
+        </w:tc>
+        <w:tc>
+          <w:tcPr>
+            <w:tcW w:type="dxa" w:w="8352"/>
+            <w:shd w:fill="FFFFFF"/>
+            <w:tcMar>
+              <w:top w:w="125" w:type="dxa"/>
+              <w:start w:w="140" w:type="dxa"/>
+              <w:bottom w:w="125" w:type="dxa"/>
+              <w:end w:w="140" w:type="dxa"/>
+            </w:tcMar>
+            <w:vAlign w:val="center"/>
+            <w:tcBorders>
+              <w:top w:val="single" w:sz="5" w:color="D8D6D0"/>
+              <w:start w:val="single" w:sz="5" w:color="D8D6D0"/>
+              <w:bottom w:val="single" w:sz="5" w:color="D8D6D0"/>
+              <w:end w:val="single" w:sz="5" w:color="D8D6D0"/>
+            </w:tcBorders>
+          </w:tcPr>
+          <w:p>
+            <w:pPr>
+              <w:spacing w:after="0" w:line="269" w:lineRule="auto"/>
+            </w:pPr>
+            <w:r>
+              <w:rPr>
+                <w:rFonts w:ascii="Arial" w:hAnsi="Arial"/>
+                <w:b w:val="0"/>
+                <w:i w:val="0"/>
+                <w:caps w:val="0"/>
+                <w:color w:val="0B0C0E"/>
+                <w:sz w:val="17"/>
+              </w:rPr>
+              <w:t>Freeze workout telemetry and story audio. Resume run is primary; ending names the summary destination.</w:t>
+            </w:r>
+          </w:p>
+        </w:tc>
+      </w:tr>
+      <w:tr>
+        <w:tc>
+          <w:tcPr>
+            <w:tcW w:type="dxa" w:w="1944"/>
+            <w:shd w:fill="FAF9F6"/>
+            <w:tcMar>
+              <w:top w:w="125" w:type="dxa"/>
+              <w:start w:w="140" w:type="dxa"/>
+              <w:bottom w:w="125" w:type="dxa"/>
+              <w:end w:w="140" w:type="dxa"/>
+            </w:tcMar>
+            <w:vAlign w:val="center"/>
+            <w:tcBorders>
+              <w:top w:val="single" w:sz="5" w:color="D8D6D0"/>
+              <w:start w:val="single" w:sz="5" w:color="D8D6D0"/>
+              <w:bottom w:val="single" w:sz="5" w:color="D8D6D0"/>
+              <w:end w:val="single" w:sz="5" w:color="D8D6D0"/>
+            </w:tcBorders>
+          </w:tcPr>
+          <w:p>
+            <w:pPr>
+              <w:spacing w:after="0" w:line="269" w:lineRule="auto"/>
+            </w:pPr>
+            <w:r>
+              <w:rPr>
+                <w:rFonts w:ascii="Arial" w:hAnsi="Arial"/>
+                <w:b/>
+                <w:i w:val="0"/>
+                <w:caps w:val="0"/>
+                <w:color w:val="0B0C0E"/>
+                <w:sz w:val="17"/>
+              </w:rPr>
+              <w:t>End</w:t>
+            </w:r>
+          </w:p>
+        </w:tc>
+        <w:tc>
+          <w:tcPr>
+            <w:tcW w:type="dxa" w:w="8352"/>
+            <w:shd w:fill="FAF9F6"/>
+            <w:tcMar>
+              <w:top w:w="125" w:type="dxa"/>
+              <w:start w:w="140" w:type="dxa"/>
+              <w:bottom w:w="125" w:type="dxa"/>
+              <w:end w:w="140" w:type="dxa"/>
+            </w:tcMar>
+            <w:vAlign w:val="center"/>
+            <w:tcBorders>
+              <w:top w:val="single" w:sz="5" w:color="D8D6D0"/>
+              <w:start w:val="single" w:sz="5" w:color="D8D6D0"/>
+              <w:bottom w:val="single" w:sz="5" w:color="D8D6D0"/>
+              <w:end w:val="single" w:sz="5" w:color="D8D6D0"/>
+            </w:tcBorders>
+          </w:tcPr>
+          <w:p>
+            <w:pPr>
+              <w:spacing w:after="0" w:line="269" w:lineRule="auto"/>
+            </w:pPr>
+            <w:r>
+              <w:rPr>
+                <w:rFonts w:ascii="Arial" w:hAnsi="Arial"/>
+                <w:b w:val="0"/>
+                <w:i w:val="0"/>
+                <w:caps w:val="0"/>
+                <w:color w:val="0B0C0E"/>
+                <w:sz w:val="17"/>
+              </w:rPr>
+              <w:t>Snapshot elapsed time, distance, average pace and the current authored story node.</w:t>
+            </w:r>
+          </w:p>
+        </w:tc>
+      </w:tr>
+      <w:tr>
+        <w:tc>
+          <w:tcPr>
+            <w:tcW w:type="dxa" w:w="1944"/>
+            <w:shd w:fill="FFFFFF"/>
+            <w:tcMar>
+              <w:top w:w="125" w:type="dxa"/>
+              <w:start w:w="140" w:type="dxa"/>
+              <w:bottom w:w="125" w:type="dxa"/>
+              <w:end w:w="140" w:type="dxa"/>
+            </w:tcMar>
+            <w:vAlign w:val="center"/>
+            <w:tcBorders>
+              <w:top w:val="single" w:sz="5" w:color="D8D6D0"/>
+              <w:start w:val="single" w:sz="5" w:color="D8D6D0"/>
+              <w:bottom w:val="single" w:sz="5" w:color="D8D6D0"/>
+              <w:end w:val="single" w:sz="5" w:color="D8D6D0"/>
+            </w:tcBorders>
+          </w:tcPr>
+          <w:p>
+            <w:pPr>
+              <w:spacing w:after="0" w:line="269" w:lineRule="auto"/>
+            </w:pPr>
+            <w:r>
+              <w:rPr>
+                <w:rFonts w:ascii="Arial" w:hAnsi="Arial"/>
+                <w:b/>
+                <w:i w:val="0"/>
+                <w:caps w:val="0"/>
+                <w:color w:val="0B0C0E"/>
+                <w:sz w:val="17"/>
+              </w:rPr>
+              <w:t>Summary</w:t>
+            </w:r>
+          </w:p>
+        </w:tc>
+        <w:tc>
+          <w:tcPr>
+            <w:tcW w:type="dxa" w:w="8352"/>
+            <w:shd w:fill="FFFFFF"/>
+            <w:tcMar>
+              <w:top w:w="125" w:type="dxa"/>
+              <w:start w:w="140" w:type="dxa"/>
+              <w:bottom w:w="125" w:type="dxa"/>
+              <w:end w:w="140" w:type="dxa"/>
+            </w:tcMar>
+            <w:vAlign w:val="center"/>
+            <w:tcBorders>
+              <w:top w:val="single" w:sz="5" w:color="D8D6D0"/>
+              <w:start w:val="single" w:sz="5" w:color="D8D6D0"/>
+              <w:bottom w:val="single" w:sz="5" w:color="D8D6D0"/>
+              <w:end w:val="single" w:sz="5" w:color="D8D6D0"/>
+            </w:tcBorders>
+          </w:tcPr>
+          <w:p>
+            <w:pPr>
+              <w:spacing w:after="0" w:line="269" w:lineRule="auto"/>
+            </w:pPr>
+            <w:r>
+              <w:rPr>
+                <w:rFonts w:ascii="Arial" w:hAnsi="Arial"/>
+                <w:b w:val="0"/>
+                <w:i w:val="0"/>
+                <w:caps w:val="0"/>
+                <w:color w:val="0B0C0E"/>
+                <w:sz w:val="17"/>
+              </w:rPr>
+              <w:t>State that the run is saved without implying the current story beat was completed.</w:t>
+            </w:r>
+          </w:p>
+        </w:tc>
+      </w:tr>
+      <w:tr>
+        <w:tc>
+          <w:tcPr>
+            <w:tcW w:type="dxa" w:w="1944"/>
+            <w:shd w:fill="FAF9F6"/>
+            <w:tcMar>
+              <w:top w:w="125" w:type="dxa"/>
+              <w:start w:w="140" w:type="dxa"/>
+              <w:bottom w:w="125" w:type="dxa"/>
+              <w:end w:w="140" w:type="dxa"/>
+            </w:tcMar>
+            <w:vAlign w:val="center"/>
+            <w:tcBorders>
+              <w:top w:val="single" w:sz="5" w:color="D8D6D0"/>
+              <w:start w:val="single" w:sz="5" w:color="D8D6D0"/>
+              <w:bottom w:val="single" w:sz="5" w:color="D8D6D0"/>
+              <w:end w:val="single" w:sz="5" w:color="D8D6D0"/>
+            </w:tcBorders>
+          </w:tcPr>
+          <w:p>
+            <w:pPr>
+              <w:spacing w:after="0" w:line="269" w:lineRule="auto"/>
+            </w:pPr>
+            <w:r>
+              <w:rPr>
+                <w:rFonts w:ascii="Arial" w:hAnsi="Arial"/>
+                <w:b/>
+                <w:i w:val="0"/>
+                <w:caps w:val="0"/>
+                <w:color w:val="0B0C0E"/>
+                <w:sz w:val="17"/>
+              </w:rPr>
+              <w:t>Resume</w:t>
+            </w:r>
+          </w:p>
+        </w:tc>
+        <w:tc>
+          <w:tcPr>
+            <w:tcW w:type="dxa" w:w="8352"/>
+            <w:shd w:fill="FAF9F6"/>
+            <w:tcMar>
+              <w:top w:w="125" w:type="dxa"/>
+              <w:start w:w="140" w:type="dxa"/>
+              <w:bottom w:w="125" w:type="dxa"/>
+              <w:end w:w="140" w:type="dxa"/>
+            </w:tcMar>
+            <w:vAlign w:val="center"/>
+            <w:tcBorders>
+              <w:top w:val="single" w:sz="5" w:color="D8D6D0"/>
+              <w:start w:val="single" w:sz="5" w:color="D8D6D0"/>
+              <w:bottom w:val="single" w:sz="5" w:color="D8D6D0"/>
+              <w:end w:val="single" w:sz="5" w:color="D8D6D0"/>
+            </w:tcBorders>
+          </w:tcPr>
+          <w:p>
+            <w:pPr>
+              <w:spacing w:after="0" w:line="269" w:lineRule="auto"/>
+            </w:pPr>
+            <w:r>
+              <w:rPr>
+                <w:rFonts w:ascii="Arial" w:hAnsi="Arial"/>
+                <w:b w:val="0"/>
+                <w:i w:val="0"/>
+                <w:caps w:val="0"/>
+                <w:color w:val="0B0C0E"/>
+                <w:sz w:val="17"/>
+              </w:rPr>
+              <w:t>Return to pre-run planning. Reset physical stats; continue the same saved story node and run state.</w:t>
+            </w:r>
+          </w:p>
+        </w:tc>
+      </w:tr>
+    </w:tbl>
+    <w:p>
+      <w:pPr>
+        <w:keepLines w:val="0"/>
+        <w:spacing w:before="0" w:after="100" w:line="276" w:lineRule="auto"/>
+        <w:jc w:val="left"/>
+      </w:pPr>
+    </w:p>
+    <w:tbl>
+      <w:tblPr>
+        <w:tblW w:type="dxa" w:w="10296"/>
+        <w:jc w:val="left"/>
+        <w:tblLayout w:type="fixed"/>
+        <w:tblLook w:firstColumn="1" w:firstRow="1" w:lastColumn="0" w:lastRow="0" w:noHBand="0" w:noVBand="1" w:val="04A0"/>
+        <w:tblInd w:w="0" w:type="dxa"/>
+      </w:tblPr>
+      <w:tblGrid>
+        <w:gridCol w:w="10296"/>
+      </w:tblGrid>
+      <w:tr>
+        <w:tc>
+          <w:tcPr>
+            <w:tcW w:type="dxa" w:w="10296"/>
+            <w:shd w:fill="F4F2ED"/>
+            <w:tcMar>
+              <w:top w:w="180" w:type="dxa"/>
+              <w:start w:w="210" w:type="dxa"/>
+              <w:bottom w:w="180" w:type="dxa"/>
+              <w:end w:w="210" w:type="dxa"/>
+            </w:tcMar>
+            <w:tcBorders>
+              <w:start w:val="single" w:sz="22" w:color="FF4F2E"/>
+            </w:tcBorders>
+          </w:tcPr>
+          <w:p>
+            <w:pPr>
+              <w:spacing w:after="60"/>
+            </w:pPr>
+            <w:r>
+              <w:rPr>
+                <w:rFonts w:ascii="Arial" w:hAnsi="Arial"/>
+                <w:b/>
+                <w:i w:val="0"/>
+                <w:caps w:val="0"/>
+                <w:color w:val="FF4F2E"/>
+                <w:sz w:val="16"/>
+              </w:rPr>
+              <w:t>CONTINUATION CONTRACT</w:t>
+            </w:r>
+          </w:p>
+          <w:p>
+            <w:pPr>
+              <w:spacing w:after="0" w:line="288" w:lineRule="auto"/>
+            </w:pPr>
+            <w:r>
+              <w:rPr>
+                <w:rFonts w:ascii="Arial" w:hAnsi="Arial"/>
+                <w:b/>
+                <w:i w:val="0"/>
+                <w:caps w:val="0"/>
+                <w:color w:val="0B0C0E"/>
+                <w:sz w:val="22"/>
+              </w:rPr>
+              <w:t>Ending a run closes the workout, not the campaign. The next run starts from zero physically and from the saved checkpoint narratively.</w:t>
+            </w:r>
+          </w:p>
+        </w:tc>
+      </w:tr>
+    </w:tbl>
+    <w:p>
+      <w:pPr>
+        <w:keepLines w:val="0"/>
+        <w:spacing w:before="0" w:after="140" w:line="276" w:lineRule="auto"/>
+        <w:jc w:val="left"/>
+      </w:pPr>
+    </w:p>
+    <w:p>
+      <w:r>
+        <w:br w:type="page"/>
+      </w:r>
+    </w:p>
+    <w:p>
+      <w:pPr>
+        <w:keepNext/>
+        <w:keepLines/>
+        <w:spacing w:before="0" w:after="120" w:line="240" w:lineRule="auto"/>
+        <w:jc w:val="left"/>
+      </w:pPr>
+      <w:r>
+        <w:rPr>
+          <w:rFonts w:ascii="Arial" w:hAnsi="Arial"/>
+          <w:b/>
+          <w:i w:val="0"/>
+          <w:caps w:val="0"/>
+          <w:color w:val="FF4F2E"/>
+          <w:sz w:val="17"/>
+        </w:rPr>
         <w:t>17 / COMPONENT LANGUAGE</w:t>
       </w:r>
     </w:p>
@@ -15856,6 +16474,220 @@
                 <w:sz w:val="17"/>
               </w:rPr>
               <w:t>Never a chat bubble or assistant avatar.</w:t>
+            </w:r>
+          </w:p>
+        </w:tc>
+      </w:tr>
+      <w:tr>
+        <w:tc>
+          <w:tcPr>
+            <w:tcW w:type="dxa" w:w="1944"/>
+            <w:shd w:fill="FFFFFF"/>
+            <w:tcMar>
+              <w:top w:w="125" w:type="dxa"/>
+              <w:start w:w="140" w:type="dxa"/>
+              <w:bottom w:w="125" w:type="dxa"/>
+              <w:end w:w="140" w:type="dxa"/>
+            </w:tcMar>
+            <w:vAlign w:val="center"/>
+            <w:tcBorders>
+              <w:top w:val="single" w:sz="5" w:color="D8D6D0"/>
+              <w:start w:val="single" w:sz="5" w:color="D8D6D0"/>
+              <w:bottom w:val="single" w:sz="5" w:color="D8D6D0"/>
+              <w:end w:val="single" w:sz="5" w:color="D8D6D0"/>
+            </w:tcBorders>
+          </w:tcPr>
+          <w:p>
+            <w:pPr>
+              <w:spacing w:after="0" w:line="269" w:lineRule="auto"/>
+            </w:pPr>
+            <w:r>
+              <w:rPr>
+                <w:rFonts w:ascii="Arial" w:hAnsi="Arial"/>
+                <w:b/>
+                <w:i w:val="0"/>
+                <w:caps w:val="0"/>
+                <w:color w:val="0B0C0E"/>
+                <w:sz w:val="17"/>
+              </w:rPr>
+              <w:t>Pause sheet</w:t>
+            </w:r>
+          </w:p>
+        </w:tc>
+        <w:tc>
+          <w:tcPr>
+            <w:tcW w:type="dxa" w:w="3240"/>
+            <w:shd w:fill="FFFFFF"/>
+            <w:tcMar>
+              <w:top w:w="125" w:type="dxa"/>
+              <w:start w:w="140" w:type="dxa"/>
+              <w:bottom w:w="125" w:type="dxa"/>
+              <w:end w:w="140" w:type="dxa"/>
+            </w:tcMar>
+            <w:vAlign w:val="center"/>
+            <w:tcBorders>
+              <w:top w:val="single" w:sz="5" w:color="D8D6D0"/>
+              <w:start w:val="single" w:sz="5" w:color="D8D6D0"/>
+              <w:bottom w:val="single" w:sz="5" w:color="D8D6D0"/>
+              <w:end w:val="single" w:sz="5" w:color="D8D6D0"/>
+            </w:tcBorders>
+          </w:tcPr>
+          <w:p>
+            <w:pPr>
+              <w:spacing w:after="0" w:line="269" w:lineRule="auto"/>
+            </w:pPr>
+            <w:r>
+              <w:rPr>
+                <w:rFonts w:ascii="Arial" w:hAnsi="Arial"/>
+                <w:b w:val="0"/>
+                <w:i w:val="0"/>
+                <w:caps w:val="0"/>
+                <w:color w:val="0B0C0E"/>
+                <w:sz w:val="17"/>
+              </w:rPr>
+              <w:t>paused / resuming / ending</w:t>
+            </w:r>
+          </w:p>
+        </w:tc>
+        <w:tc>
+          <w:tcPr>
+            <w:tcW w:type="dxa" w:w="5112"/>
+            <w:shd w:fill="FFFFFF"/>
+            <w:tcMar>
+              <w:top w:w="125" w:type="dxa"/>
+              <w:start w:w="140" w:type="dxa"/>
+              <w:bottom w:w="125" w:type="dxa"/>
+              <w:end w:w="140" w:type="dxa"/>
+            </w:tcMar>
+            <w:vAlign w:val="center"/>
+            <w:tcBorders>
+              <w:top w:val="single" w:sz="5" w:color="D8D6D0"/>
+              <w:start w:val="single" w:sz="5" w:color="D8D6D0"/>
+              <w:bottom w:val="single" w:sz="5" w:color="D8D6D0"/>
+              <w:end w:val="single" w:sz="5" w:color="D8D6D0"/>
+            </w:tcBorders>
+          </w:tcPr>
+          <w:p>
+            <w:pPr>
+              <w:spacing w:after="0" w:line="269" w:lineRule="auto"/>
+            </w:pPr>
+            <w:r>
+              <w:rPr>
+                <w:rFonts w:ascii="Arial" w:hAnsi="Arial"/>
+                <w:b w:val="0"/>
+                <w:i w:val="0"/>
+                <w:caps w:val="0"/>
+                <w:color w:val="0B0C0E"/>
+                <w:sz w:val="17"/>
+              </w:rPr>
+              <w:t>Resume is primary; ending names the summary destination.</w:t>
+            </w:r>
+          </w:p>
+        </w:tc>
+      </w:tr>
+      <w:tr>
+        <w:tc>
+          <w:tcPr>
+            <w:tcW w:type="dxa" w:w="1944"/>
+            <w:shd w:fill="FAF9F6"/>
+            <w:tcMar>
+              <w:top w:w="125" w:type="dxa"/>
+              <w:start w:w="140" w:type="dxa"/>
+              <w:bottom w:w="125" w:type="dxa"/>
+              <w:end w:w="140" w:type="dxa"/>
+            </w:tcMar>
+            <w:vAlign w:val="center"/>
+            <w:tcBorders>
+              <w:top w:val="single" w:sz="5" w:color="D8D6D0"/>
+              <w:start w:val="single" w:sz="5" w:color="D8D6D0"/>
+              <w:bottom w:val="single" w:sz="5" w:color="D8D6D0"/>
+              <w:end w:val="single" w:sz="5" w:color="D8D6D0"/>
+            </w:tcBorders>
+          </w:tcPr>
+          <w:p>
+            <w:pPr>
+              <w:spacing w:after="0" w:line="269" w:lineRule="auto"/>
+            </w:pPr>
+            <w:r>
+              <w:rPr>
+                <w:rFonts w:ascii="Arial" w:hAnsi="Arial"/>
+                <w:b/>
+                <w:i w:val="0"/>
+                <w:caps w:val="0"/>
+                <w:color w:val="0B0C0E"/>
+                <w:sz w:val="17"/>
+              </w:rPr>
+              <w:t>Early-run summary</w:t>
+            </w:r>
+          </w:p>
+        </w:tc>
+        <w:tc>
+          <w:tcPr>
+            <w:tcW w:type="dxa" w:w="3240"/>
+            <w:shd w:fill="FAF9F6"/>
+            <w:tcMar>
+              <w:top w:w="125" w:type="dxa"/>
+              <w:start w:w="140" w:type="dxa"/>
+              <w:bottom w:w="125" w:type="dxa"/>
+              <w:end w:w="140" w:type="dxa"/>
+            </w:tcMar>
+            <w:vAlign w:val="center"/>
+            <w:tcBorders>
+              <w:top w:val="single" w:sz="5" w:color="D8D6D0"/>
+              <w:start w:val="single" w:sz="5" w:color="D8D6D0"/>
+              <w:bottom w:val="single" w:sz="5" w:color="D8D6D0"/>
+              <w:end w:val="single" w:sz="5" w:color="D8D6D0"/>
+            </w:tcBorders>
+          </w:tcPr>
+          <w:p>
+            <w:pPr>
+              <w:spacing w:after="0" w:line="269" w:lineRule="auto"/>
+            </w:pPr>
+            <w:r>
+              <w:rPr>
+                <w:rFonts w:ascii="Arial" w:hAnsi="Arial"/>
+                <w:b w:val="0"/>
+                <w:i w:val="0"/>
+                <w:caps w:val="0"/>
+                <w:color w:val="0B0C0E"/>
+                <w:sz w:val="17"/>
+              </w:rPr>
+              <w:t>saved / continuing</w:t>
+            </w:r>
+          </w:p>
+        </w:tc>
+        <w:tc>
+          <w:tcPr>
+            <w:tcW w:type="dxa" w:w="5112"/>
+            <w:shd w:fill="FAF9F6"/>
+            <w:tcMar>
+              <w:top w:w="125" w:type="dxa"/>
+              <w:start w:w="140" w:type="dxa"/>
+              <w:bottom w:w="125" w:type="dxa"/>
+              <w:end w:w="140" w:type="dxa"/>
+            </w:tcMar>
+            <w:vAlign w:val="center"/>
+            <w:tcBorders>
+              <w:top w:val="single" w:sz="5" w:color="D8D6D0"/>
+              <w:start w:val="single" w:sz="5" w:color="D8D6D0"/>
+              <w:bottom w:val="single" w:sz="5" w:color="D8D6D0"/>
+              <w:end w:val="single" w:sz="5" w:color="D8D6D0"/>
+            </w:tcBorders>
+          </w:tcPr>
+          <w:p>
+            <w:pPr>
+              <w:spacing w:after="0" w:line="269" w:lineRule="auto"/>
+            </w:pPr>
+            <w:r>
+              <w:rPr>
+                <w:rFonts w:ascii="Arial" w:hAnsi="Arial"/>
+                <w:b w:val="0"/>
+                <w:i w:val="0"/>
+                <w:caps w:val="0"/>
+                <w:color w:val="0B0C0E"/>
+                <w:sz w:val="17"/>
+              </w:rPr>
+              <w:t>Run facts first, then the named story checkpoint.</w:t>
             </w:r>
           </w:p>
         </w:tc>
@@ -19591,7 +20423,7 @@
                 <w:color w:val="0B0C0E"/>
                 <w:sz w:val="17"/>
               </w:rPr>
-              <w:t>The recap leads with calories, pace or badges.</w:t>
+              <w:t>A completed-story recap leads with calories, pace or badges.</w:t>
             </w:r>
           </w:p>
         </w:tc>
@@ -19626,7 +20458,7 @@
                 <w:color w:val="0B0C0E"/>
                 <w:sz w:val="17"/>
               </w:rPr>
-              <w:t>The run did not become a story.</w:t>
+              <w:t>The run did not become a story; stats-first treatment is reserved for an early-run summary.</w:t>
             </w:r>
           </w:p>
         </w:tc>
@@ -21358,6 +22190,24 @@
   </w:abstractNum>
   <w:num w:numId="13">
     <w:abstractNumId w:val="12"/>
+  </w:num>
+  <w:abstractNum w:abstractNumId="13">
+    <w:multiLevelType w:val="singleLevel"/>
+    <w:lvl w:ilvl="0">
+      <w:start w:val="1"/>
+      <w:numFmt w:val="decimal"/>
+      <w:lvlText w:val="%1."/>
+      <w:suff w:val="tab"/>
+      <w:pPr>
+        <w:tabs>
+          <w:tab w:val="num" w:pos="430"/>
+        </w:tabs>
+        <w:ind w:left="430" w:hanging="250"/>
+      </w:pPr>
+    </w:lvl>
+  </w:abstractNum>
+  <w:num w:numId="14">
+    <w:abstractNumId w:val="13"/>
   </w:num>
 </w:numbering>
 </file>

</xml_diff>